<commit_message>
remove compositional overlap ratio
</commit_message>
<xml_diff>
--- a/Manuscript/Manuscript_V13.docx
+++ b/Manuscript/Manuscript_V13.docx
@@ -864,9 +864,9 @@
                           <a:avLst/>
                           <a:gdLst>
                             <a:gd name="textAreaLeft" fmla="*/ 0 w 3369600"/>
-                            <a:gd name="textAreaRight" fmla="*/ 3369960 w 3369600"/>
+                            <a:gd name="textAreaRight" fmla="*/ 3370320 w 3369600"/>
                             <a:gd name="textAreaTop" fmla="*/ 0 h 10800"/>
-                            <a:gd name="textAreaBottom" fmla="*/ 11160 h 10800"/>
+                            <a:gd name="textAreaBottom" fmla="*/ 11520 h 10800"/>
                           </a:gdLst>
                           <a:ahLst/>
                           <a:rect l="textAreaLeft" t="textAreaTop" r="textAreaRight" b="textAreaBottom"/>
@@ -1133,15 +1133,13 @@
         </w:rPr>
         <w:t xml:space="preserve">. However, a fundamental challenge in tumoral microbiome research is distinguishing genuine tumor resident microorganisms from environmental contaminants introduced during sample collection, processing, and sequencing. Low biomass specimens such as tumor samples are particularly vulnerable to contamination, as trace microbial DNA from reagents, laboratory surfaces, and laboratory personnel (LP) can </w:t>
       </w:r>
-      <w:ins w:id="14" w:author="adm_neesse" w:date="2026-08-01T09:27:00Z">
-        <w:r>
-          <w:rPr>
-            <w:rFonts w:cs="Arial" w:ascii="Arial" w:hAnsi="Arial"/>
-          </w:rPr>
-          <w:t>outnumber</w:t>
-        </w:r>
-      </w:ins>
-      <w:del w:id="15" w:author="adm_neesse" w:date="2026-08-01T09:27:00Z">
+      <w:r>
+        <w:rPr>
+          <w:rFonts w:cs="Arial" w:ascii="Arial" w:hAnsi="Arial"/>
+        </w:rPr>
+        <w:t>outnumber</w:t>
+      </w:r>
+      <w:del w:id="14" w:author="adm_neesse" w:date="2026-08-01T09:27:00Z">
         <w:r>
           <w:rPr>
             <w:rFonts w:cs="Arial" w:ascii="Arial" w:hAnsi="Arial"/>
@@ -1765,21 +1763,7 @@
         <w:rPr>
           <w:rFonts w:cs="Arial" w:ascii="Arial" w:hAnsi="Arial"/>
         </w:rPr>
-        <w:t>. Indeed, a blank paraffin negative control was processed by first scraping paraffin into lysis buffer for DNA extraction, followed by the inclusion of the extracted material in sterile water for subsequent PCR amplification. This sequential workflow (Fig. 1A) is consistent with the observed contamination pattern, where paraffin controls harbored the highest number of environmental taxa, followed by buffer and PCR controls. Furthermore, β diversity reveals that NCT are significantly clustering with respect to control types (Fig. 1C and Table S3). Moreover, NCT are also heavily grouped with respect to LP, year, and season of processing. Indeed, the distance-based redundancy variation is mostly explain</w:t>
-      </w:r>
-      <w:ins w:id="16" w:author="adm_neesse" w:date="2026-08-01T09:33:00Z">
-        <w:r>
-          <w:rPr>
-            <w:rFonts w:cs="Arial" w:ascii="Arial" w:hAnsi="Arial"/>
-          </w:rPr>
-          <w:t>ed</w:t>
-        </w:r>
-      </w:ins>
-      <w:r>
-        <w:rPr>
-          <w:rFonts w:cs="Arial" w:ascii="Arial" w:hAnsi="Arial"/>
-        </w:rPr>
-        <w:t xml:space="preserve"> by LP (adj. R</w:t>
+        <w:t>. Indeed, a blank paraffin negative control was processed by first scraping paraffin into lysis buffer for DNA extraction, followed by the inclusion of the extracted material in sterile water for subsequent PCR amplification. This sequential workflow (Fig. 1A) is consistent with the observed contamination pattern, where paraffin controls harbored the highest number of environmental taxa, followed by buffer and PCR controls. Furthermore, β diversity reveals that NCT are significantly clustering with respect to control types (Fig. 1C and Table S3). Moreover, NCT are also heavily grouped with respect to LP, year, and season of processing. Indeed, the distance-based redundancy variation is mostly explained by LP (adj. R</w:t>
       </w:r>
       <w:r>
         <w:rPr>
@@ -1847,29 +1831,7 @@
         <w:rPr>
           <w:rFonts w:cs="Arial" w:ascii="Arial" w:hAnsi="Arial"/>
         </w:rPr>
-        <w:t>1.2 M</w:t>
-      </w:r>
-      <w:ins w:id="17" w:author="adm_neesse" w:date="2026-08-01T09:33:00Z">
-        <w:r>
-          <w:rPr>
-            <w:rFonts w:cs="Arial" w:ascii="Arial" w:hAnsi="Arial"/>
-          </w:rPr>
-          <w:t>ultiple</w:t>
-        </w:r>
-      </w:ins>
-      <w:del w:id="18" w:author="adm_neesse" w:date="2026-08-01T09:33:00Z">
-        <w:r>
-          <w:rPr>
-            <w:rFonts w:cs="Arial" w:ascii="Arial" w:hAnsi="Arial"/>
-          </w:rPr>
-          <w:delText>any</w:delText>
-        </w:r>
-      </w:del>
-      <w:r>
-        <w:rPr>
-          <w:rFonts w:cs="Arial" w:ascii="Arial" w:hAnsi="Arial"/>
-        </w:rPr>
-        <w:t xml:space="preserve"> environmental taxa are found in NCTs, at varying abundance</w:t>
+        <w:t>1.2 Multiple environmental taxa are found in NCTs, at varying abundance</w:t>
       </w:r>
     </w:p>
     <w:p>
@@ -2000,7 +1962,7 @@
         </w:rPr>
         <w:t>, a ubiquitous environmental genus frequently detected in hospital and laboratory environments, was among the most abundant taxa in nearly all negative controls</w:t>
       </w:r>
-      <w:del w:id="19" w:author="adm_neesse" w:date="2026-08-01T09:34:00Z">
+      <w:del w:id="15" w:author="adm_neesse" w:date="2026-08-01T09:34:00Z">
         <w:r>
           <w:rPr>
             <w:rFonts w:cs="Arial" w:ascii="Arial" w:hAnsi="Arial"/>
@@ -2125,21 +2087,13 @@
         </w:rPr>
         <w:t>, were high</w:t>
       </w:r>
-      <w:ins w:id="20" w:author="adm_neesse" w:date="2026-08-01T09:34:00Z">
-        <w:r>
-          <w:rPr>
-            <w:rFonts w:cs="Arial" w:ascii="Arial" w:hAnsi="Arial"/>
-          </w:rPr>
-          <w:t>ly</w:t>
-        </w:r>
-      </w:ins>
-      <w:r>
-        <w:rPr>
-          <w:rFonts w:cs="Arial" w:ascii="Arial" w:hAnsi="Arial"/>
-        </w:rPr>
-        <w:t xml:space="preserve"> prevalent and less abundant in the NCT suggesting an introduction of contamination by </w:t>
-      </w:r>
-      <w:del w:id="21" w:author="adm_neesse" w:date="2026-08-01T09:34:00Z">
+      <w:r>
+        <w:rPr>
+          <w:rFonts w:cs="Arial" w:ascii="Arial" w:hAnsi="Arial"/>
+        </w:rPr>
+        <w:t xml:space="preserve">ly prevalent and less abundant in the NCT suggesting an introduction of contamination by </w:t>
+      </w:r>
+      <w:del w:id="16" w:author="adm_neesse" w:date="2026-08-01T09:34:00Z">
         <w:r>
           <w:rPr>
             <w:rFonts w:cs="Arial" w:ascii="Arial" w:hAnsi="Arial"/>
@@ -2153,7 +2107,7 @@
         </w:rPr>
         <w:t>LP</w:t>
       </w:r>
-      <w:del w:id="22" w:author="adm_neesse" w:date="2026-08-01T09:34:00Z">
+      <w:del w:id="17" w:author="adm_neesse" w:date="2026-08-01T09:34:00Z">
         <w:r>
           <w:rPr>
             <w:rFonts w:cs="Arial" w:ascii="Arial" w:hAnsi="Arial"/>
@@ -2165,17 +2119,9 @@
         <w:rPr>
           <w:rFonts w:cs="Arial" w:ascii="Arial" w:hAnsi="Arial"/>
         </w:rPr>
-        <w:t xml:space="preserve">. This coexistence of environmental and human commensal taxa in NCT requires </w:t>
-      </w:r>
-      <w:ins w:id="23" w:author="adm_neesse" w:date="2026-08-01T09:35:00Z">
-        <w:r>
-          <w:rPr>
-            <w:rFonts w:cs="Arial" w:ascii="Arial" w:hAnsi="Arial"/>
-          </w:rPr>
-          <w:t>sophisticated</w:t>
-        </w:r>
-      </w:ins>
-      <w:del w:id="24" w:author="adm_neesse" w:date="2026-08-01T09:35:00Z">
+        <w:t>. This coexistence of environmental and human commensal taxa in NCT requires sophisticated</w:t>
+      </w:r>
+      <w:del w:id="18" w:author="adm_neesse" w:date="2026-08-01T09:35:00Z">
         <w:r>
           <w:rPr>
             <w:rFonts w:cs="Arial" w:ascii="Arial" w:hAnsi="Arial"/>
@@ -2203,29 +2149,7 @@
         <w:rPr>
           <w:rFonts w:cs="Arial" w:ascii="Arial" w:hAnsi="Arial"/>
         </w:rPr>
-        <w:t xml:space="preserve">2. </w:t>
-      </w:r>
-      <w:ins w:id="25" w:author="adm_neesse" w:date="2026-08-01T09:36:00Z">
-        <w:r>
-          <w:rPr>
-            <w:rFonts w:cs="Arial" w:ascii="Arial" w:hAnsi="Arial"/>
-          </w:rPr>
-          <w:t>Lab personnel</w:t>
-        </w:r>
-      </w:ins>
-      <w:del w:id="26" w:author="adm_neesse" w:date="2026-08-01T09:36:00Z">
-        <w:r>
-          <w:rPr>
-            <w:rFonts w:cs="Arial" w:ascii="Arial" w:hAnsi="Arial"/>
-          </w:rPr>
-          <w:delText>Technician</w:delText>
-        </w:r>
-      </w:del>
-      <w:r>
-        <w:rPr>
-          <w:rFonts w:cs="Arial" w:ascii="Arial" w:hAnsi="Arial"/>
-        </w:rPr>
-        <w:t xml:space="preserve"> Influences Microbiome More Than Processing Environment</w:t>
+        <w:t>2. Lab personnel Influences Microbiome More Than Processing Environment</w:t>
       </w:r>
     </w:p>
     <w:p>
@@ -2242,21 +2166,7 @@
         <w:rPr>
           <w:rFonts w:cs="Arial" w:ascii="Arial" w:hAnsi="Arial"/>
         </w:rPr>
-        <w:t xml:space="preserve">As we discovered highly prevalent and abundant oral microbiota in our NCT and identified LP as major contributor of overall variance in the distance-based redundancy analysis (db-RDA), we further explored the possible batch effect that is introduced by </w:t>
-      </w:r>
-      <w:del w:id="27" w:author="adm_neesse" w:date="2026-08-01T09:37:00Z">
-        <w:r>
-          <w:rPr>
-            <w:rFonts w:cs="Arial" w:ascii="Arial" w:hAnsi="Arial"/>
-          </w:rPr>
-          <w:delText xml:space="preserve">the </w:delText>
-        </w:r>
-      </w:del>
-      <w:r>
-        <w:rPr>
-          <w:rFonts w:cs="Arial" w:ascii="Arial" w:hAnsi="Arial"/>
-        </w:rPr>
-        <w:t xml:space="preserve">LP that processed the samples. To this end, two LP performed DNA extraction, library preparation and sequencing of four sterile water samples, which were equally distributed. The experiment was repeated in different environments. First, one LP processed samples in a low-germ environment and the other one under standard condition. For the repeated sample LP switched processing environment (Fig. 2A). Notably, α diversity analysis revealed no significant difference with respect to environmental condition (Observed species: IRR = 0.97, p = 0.584, Shannon index: β = 0.95, p = 0.363, Fig. S1, Table S6), but a clear distinction between LPs was observed (Observed species: IRR = 1.32, p &lt; 0.001***, Shannon index: β = 1.74, p &lt; 0.001***, Fig. 2B and Table S6). In line with this results, β diversity conducted under wrench normalization and Bray-Curtis dissimilarity revealed significant clustering by LP identity (p-value = 0.05*), with no significant effect of processing environments (Fig. 2C, p-value = 0.245, Table S7). As this study employed a two-factor experimental design, the effect of each factor was evaluated while controlling for the other factor. Across various combinations of distance metrics and abundance transformations, LP remained a significant factor. Furthermore, its consistently high </w:t>
+        <w:t xml:space="preserve">As we discovered highly prevalent and abundant oral microbiota in our NCT and identified LP as major contributor of overall variance in the distance-based redundancy analysis (db-RDA), we further explored the possible batch effect that is introduced by LP that processed the samples. To this end, two LP performed DNA extraction, library preparation and sequencing of four sterile water samples, which were equally distributed. The experiment was repeated in different environments. First, one LP processed samples in a low-germ environment and the other one under standard condition. For the repeated sample LP switched processing environment (Fig. 2A). Notably, α diversity analysis revealed no significant difference with respect to environmental condition (Observed species: IRR = 0.97, p = 0.584, Shannon index: β = 0.95, p = 0.363, Fig. S1, Table S6), but a clear distinction between LPs was observed (Observed species: IRR = 1.32, p &lt; 0.001***, Shannon index: β = 1.74, p &lt; 0.001***, Fig. 2B and Table S6). In line with this results, β diversity conducted under wrench normalization and Bray-Curtis dissimilarity revealed significant clustering by LP identity (p-value = 0.05*), with no significant effect of processing environments (Fig. 2C, p-value = 0.245, Table S7). As this study employed a two-factor experimental design, the effect of each factor was evaluated while controlling for the other factor. Across various combinations of distance metrics and abundance transformations, LP remained a significant factor. Furthermore, its consistently high </w:t>
       </w:r>
       <w:r>
         <w:rPr>
@@ -2352,96 +2262,74 @@
         </w:rPr>
         <w:t xml:space="preserve">In light of the low-biomass environment, the assessment of intratumoral microbiota is susceptible to the presence of ubiquitous contaminants. To this end, a thorough decontamination approach is necessary to disentangle contaminants from true signals. To identify the most robust method, we performed benchmarking experiments applying four decontamination strategies, including restrictive filtering, decontam, SCRuB, and multi-layer statistical testing approach such as Nj to the whole 16S rRNA gene profiles of 18 fresh frozen (FF) PDAC samples from </w:t>
       </w:r>
-      <w:ins w:id="28" w:author="adm_neesse" w:date="2026-08-01T09:57:00Z">
-        <w:r>
-          <w:rPr>
-            <w:rFonts w:cs="Arial" w:ascii="Arial" w:hAnsi="Arial"/>
-            <w:i/>
-            <w:iCs/>
-            <w:color w:themeColor="text1" w:val="000000"/>
-          </w:rPr>
-          <w:t>LSL-Kras</w:t>
-        </w:r>
-      </w:ins>
-      <w:ins w:id="29" w:author="adm_neesse" w:date="2026-08-01T09:57:00Z">
-        <w:r>
-          <w:rPr>
-            <w:rFonts w:cs="Arial" w:ascii="Arial" w:hAnsi="Arial"/>
-            <w:i/>
-            <w:iCs/>
-            <w:color w:themeColor="text1" w:val="000000"/>
-            <w:vertAlign w:val="superscript"/>
-          </w:rPr>
-          <w:t>G12D/+</w:t>
-        </w:r>
-      </w:ins>
-      <w:ins w:id="30" w:author="adm_neesse" w:date="2026-08-01T09:57:00Z">
-        <w:r>
-          <w:rPr>
-            <w:rFonts w:cs="Arial" w:ascii="Arial" w:hAnsi="Arial"/>
-            <w:color w:themeColor="text1" w:val="000000"/>
-          </w:rPr>
-          <w:t>;</w:t>
-        </w:r>
-      </w:ins>
-      <w:ins w:id="31" w:author="adm_neesse" w:date="2026-08-01T09:57:00Z">
-        <w:r>
-          <w:rPr>
-            <w:rFonts w:cs="Arial" w:ascii="Arial" w:hAnsi="Arial"/>
-            <w:i/>
-            <w:iCs/>
-            <w:color w:themeColor="text1" w:val="000000"/>
-          </w:rPr>
-          <w:t>LSL-Trp53</w:t>
-        </w:r>
-      </w:ins>
-      <w:ins w:id="32" w:author="adm_neesse" w:date="2026-08-01T09:57:00Z">
-        <w:r>
-          <w:rPr>
-            <w:rFonts w:cs="Arial" w:ascii="Arial" w:hAnsi="Arial"/>
-            <w:i/>
-            <w:iCs/>
-            <w:color w:themeColor="text1" w:val="000000"/>
-            <w:vertAlign w:val="superscript"/>
-          </w:rPr>
-          <w:t>R172H/+</w:t>
-        </w:r>
-      </w:ins>
-      <w:ins w:id="33" w:author="adm_neesse" w:date="2026-08-01T09:57:00Z">
-        <w:r>
-          <w:rPr>
-            <w:rFonts w:cs="Arial" w:ascii="Arial" w:hAnsi="Arial"/>
-            <w:color w:themeColor="text1" w:val="000000"/>
-          </w:rPr>
-          <w:t>;</w:t>
-        </w:r>
-      </w:ins>
-      <w:ins w:id="34" w:author="adm_neesse" w:date="2026-08-01T09:57:00Z">
-        <w:r>
-          <w:rPr>
-            <w:rFonts w:cs="Arial" w:ascii="Arial" w:hAnsi="Arial"/>
-            <w:i/>
-            <w:iCs/>
-            <w:color w:themeColor="text1" w:val="000000"/>
-          </w:rPr>
-          <w:t>Pdx-1-Cre</w:t>
-        </w:r>
-      </w:ins>
-      <w:ins w:id="35" w:author="adm_neesse" w:date="2026-08-01T09:57:00Z">
-        <w:r>
-          <w:rPr>
-            <w:rFonts w:cs="Arial" w:ascii="Arial" w:hAnsi="Arial"/>
-          </w:rPr>
-          <w:t xml:space="preserve"> (</w:t>
-        </w:r>
-      </w:ins>
-      <w:r>
-        <w:rPr>
-          <w:rFonts w:cs="Arial" w:ascii="Arial" w:hAnsi="Arial"/>
-        </w:rPr>
-        <w:t>KPC</w:t>
-      </w:r>
-      <w:ins w:id="36" w:author="adm_neesse" w:date="2026-08-01T09:57:00Z">
+      <w:r>
+        <w:rPr>
+          <w:rFonts w:cs="Arial" w:ascii="Arial" w:hAnsi="Arial"/>
+          <w:i/>
+          <w:iCs/>
+          <w:color w:themeColor="text1" w:val="000000"/>
+        </w:rPr>
+        <w:t>LSL-Kras</w:t>
+      </w:r>
+      <w:r>
+        <w:rPr>
+          <w:rFonts w:cs="Arial" w:ascii="Arial" w:hAnsi="Arial"/>
+          <w:i/>
+          <w:iCs/>
+          <w:color w:themeColor="text1" w:val="000000"/>
+          <w:vertAlign w:val="superscript"/>
+        </w:rPr>
+        <w:t>G12D/+</w:t>
+      </w:r>
+      <w:r>
+        <w:rPr>
+          <w:rFonts w:cs="Arial" w:ascii="Arial" w:hAnsi="Arial"/>
+          <w:color w:themeColor="text1" w:val="000000"/>
+        </w:rPr>
+        <w:t>;</w:t>
+      </w:r>
+      <w:r>
+        <w:rPr>
+          <w:rFonts w:cs="Arial" w:ascii="Arial" w:hAnsi="Arial"/>
+          <w:i/>
+          <w:iCs/>
+          <w:color w:themeColor="text1" w:val="000000"/>
+        </w:rPr>
+        <w:t>LSL-Trp53</w:t>
+      </w:r>
+      <w:r>
+        <w:rPr>
+          <w:rFonts w:cs="Arial" w:ascii="Arial" w:hAnsi="Arial"/>
+          <w:i/>
+          <w:iCs/>
+          <w:color w:themeColor="text1" w:val="000000"/>
+          <w:vertAlign w:val="superscript"/>
+        </w:rPr>
+        <w:t>R172H/+</w:t>
+      </w:r>
+      <w:r>
+        <w:rPr>
+          <w:rFonts w:cs="Arial" w:ascii="Arial" w:hAnsi="Arial"/>
+          <w:color w:themeColor="text1" w:val="000000"/>
+        </w:rPr>
+        <w:t>;</w:t>
+      </w:r>
+      <w:r>
+        <w:rPr>
+          <w:rFonts w:cs="Arial" w:ascii="Arial" w:hAnsi="Arial"/>
+          <w:i/>
+          <w:iCs/>
+          <w:color w:themeColor="text1" w:val="000000"/>
+        </w:rPr>
+        <w:t>Pdx-1-Cre</w:t>
+      </w:r>
+      <w:r>
+        <w:rPr>
+          <w:rFonts w:cs="Arial" w:ascii="Arial" w:hAnsi="Arial"/>
+        </w:rPr>
+        <w:t xml:space="preserve"> (KPC</w:t>
+      </w:r>
+      <w:ins w:id="19" w:author="adm_neesse" w:date="2026-08-01T09:57:00Z">
         <w:r>
           <w:rPr>
             <w:rFonts w:cs="Arial" w:ascii="Arial" w:hAnsi="Arial"/>
@@ -2453,73 +2341,182 @@
         <w:rPr>
           <w:rFonts w:cs="Arial" w:ascii="Arial" w:hAnsi="Arial"/>
         </w:rPr>
-        <w:t xml:space="preserve"> mice</w:t>
-      </w:r>
-      <w:ins w:id="37" w:author="adm_neesse" w:date="2026-08-01T09:57:00Z">
+        <w:t xml:space="preserve"> mice bearing endogenous pancreatic tumors that closely recapitulate human PDAC biology and histology (Fig. 3A). </w:t>
+      </w:r>
+    </w:p>
+    <w:p>
+      <w:pPr>
+        <w:pStyle w:val="Heading4"/>
+        <w:rPr>
+          <w:rFonts w:ascii="Arial" w:hAnsi="Arial" w:cs="Arial"/>
+        </w:rPr>
+      </w:pPr>
+      <w:r>
+        <w:rPr>
+          <w:rFonts w:cs="Arial" w:ascii="Arial" w:hAnsi="Arial"/>
+        </w:rPr>
+        <w:t>3.1 Assessment Using Longitudinal Negative Control Survey</w:t>
+      </w:r>
+    </w:p>
+    <w:p>
+      <w:pPr>
+        <w:pStyle w:val="BodyText"/>
+        <w:spacing w:lineRule="auto" w:line="480"/>
+        <w:jc w:val="both"/>
+        <w:rPr>
+          <w:rFonts w:ascii="Arial" w:hAnsi="Arial" w:cs="Arial"/>
+        </w:rPr>
+      </w:pPr>
+      <w:r>
+        <w:rPr>
+          <w:rFonts w:cs="Arial" w:ascii="Arial" w:hAnsi="Arial"/>
+        </w:rPr>
+        <w:t xml:space="preserve">In the first approach, we leverage the longitudinal contamination survey described above as a lab-specific contamination background (CB) for the assessment. Specifically, a bacterial profile, before (non-decontaminated samples, ND) or after a certain decontamination, along with CB will be used to calculate a corresponding composite score which simultaneously rewards the removal of contaminant species in CB while preventing the excessive removal of the true taxa. </w:t>
+      </w:r>
+    </w:p>
+    <w:p>
+      <w:pPr>
+        <w:pStyle w:val="BodyText"/>
+        <w:spacing w:lineRule="auto" w:line="480"/>
+        <w:jc w:val="both"/>
+        <w:rPr>
+          <w:rFonts w:ascii="Arial" w:hAnsi="Arial" w:cs="Arial"/>
+        </w:rPr>
+      </w:pPr>
+      <w:r>
+        <w:rPr>
+          <w:rFonts w:cs="Arial" w:ascii="Arial" w:hAnsi="Arial"/>
+        </w:rPr>
+        <w:t xml:space="preserve">The Nj method achieved the highest composite score, significantly outperforming all alternatives on species level (Fig. 3B, Table S8). ND data scored lower than Nj, restrictive, and decontam method. Interestingly, the composite score from SCRuB is the smallest, even significantly smaller than ND. </w:t>
+      </w:r>
+    </w:p>
+    <w:p>
+      <w:pPr>
+        <w:pStyle w:val="Heading4"/>
+        <w:rPr>
+          <w:rFonts w:ascii="Arial" w:hAnsi="Arial" w:cs="Arial"/>
+        </w:rPr>
+      </w:pPr>
+      <w:r>
+        <w:rPr>
+          <w:rFonts w:cs="Arial" w:ascii="Arial" w:hAnsi="Arial"/>
+        </w:rPr>
+        <w:t>3.2 Assessment Using Technical Replicates</w:t>
+      </w:r>
+    </w:p>
+    <w:p>
+      <w:pPr>
+        <w:pStyle w:val="FirstParagraph"/>
+        <w:spacing w:lineRule="auto" w:line="480"/>
+        <w:jc w:val="both"/>
+        <w:rPr>
+          <w:rFonts w:ascii="Arial" w:hAnsi="Arial" w:cs="Arial"/>
+        </w:rPr>
+      </w:pPr>
+      <w:r>
+        <w:rPr>
+          <w:rFonts w:cs="Arial" w:ascii="Arial" w:hAnsi="Arial"/>
+        </w:rPr>
+        <w:t>To provide an orthogonal validation, we re-sequenced ten FF tumors from KPC mice as technical replicates more than two years after initial sequencing from a different LP to control for the batch effect. Our underlying assumption was that decontaminated profiles, should exhibit greater concordance between replicates from the same tumor sample than the technical replicates without decontamination (ND).</w:t>
+      </w:r>
+    </w:p>
+    <w:p>
+      <w:pPr>
+        <w:pStyle w:val="BodyText"/>
+        <w:spacing w:lineRule="auto" w:line="480"/>
+        <w:jc w:val="both"/>
+        <w:rPr>
+          <w:rFonts w:ascii="Arial" w:hAnsi="Arial" w:cs="Arial"/>
+        </w:rPr>
+      </w:pPr>
+      <w:r>
+        <w:rPr>
+          <w:rFonts w:cs="Arial" w:ascii="Arial" w:hAnsi="Arial"/>
+        </w:rPr>
+        <w:t xml:space="preserve">Inter-replicate dissimilarity was quantified using Aitchison distance of centered-log ratio transformed data, with pairwise comparisons assessed by paired Wilcoxon signed-rank test on species level. The Nj method obtained the smallest inter-replicate distances, indicating superiority within sample consistency (Fig. 3C, Table S9). Consistently, inter-replicate among ND samples showed the highest scores, indicating the suspected batch effect. </w:t>
+      </w:r>
+    </w:p>
+    <w:p>
+      <w:pPr>
+        <w:pStyle w:val="BodyText"/>
+        <w:spacing w:lineRule="auto" w:line="480"/>
+        <w:jc w:val="both"/>
+        <w:rPr>
+          <w:rFonts w:ascii="Arial" w:hAnsi="Arial" w:cs="Arial"/>
+        </w:rPr>
+      </w:pPr>
+      <w:r>
+        <w:rPr>
+          <w:rFonts w:cs="Arial" w:ascii="Arial" w:hAnsi="Arial"/>
+        </w:rPr>
+        <w:t>We also validated the results with other distance metric such as unweighted Jaccard showing a similar pattern (Fig. S2).</w:t>
+      </w:r>
+    </w:p>
+    <w:p>
+      <w:pPr>
+        <w:pStyle w:val="BodyText"/>
+        <w:spacing w:lineRule="auto" w:line="480"/>
+        <w:jc w:val="both"/>
+        <w:rPr>
+          <w:rFonts w:ascii="Arial" w:hAnsi="Arial" w:cs="Arial"/>
+        </w:rPr>
+      </w:pPr>
+      <w:del w:id="20" w:author="Linh Dang" w:date="2026-08-07T16:23:11Z">
         <w:r>
           <w:rPr>
             <w:rFonts w:cs="Arial" w:ascii="Arial" w:hAnsi="Arial"/>
           </w:rPr>
-          <w:t xml:space="preserve"> bearing endogenous pancreatic tumors that closely recapitulate human PDAC biology and histology</w:t>
+          <w:delText>Furthermore, compositional overlap between non-normalized replicates, measured as the proportion of shared taxa out of total detected taxa between two replicates, was also highest for Nj method (Fig. 3D). This measurement estimates the robustness of decontamination procedures. Notably, we excluded the extremely rare taxa by applying a prevalence threshold of at least two out of ten</w:delText>
         </w:r>
+      </w:del>
+      <w:ins w:id="21" w:author="adm_neesse" w:date="2026-08-01T09:44:00Z">
+        <w:del w:id="22" w:author="Linh Dang" w:date="2026-08-07T16:23:11Z">
+          <w:r>
+            <w:rPr>
+              <w:rFonts w:cs="Arial" w:ascii="Arial" w:hAnsi="Arial"/>
+            </w:rPr>
+            <w:delText>,</w:delText>
+          </w:r>
+        </w:del>
       </w:ins>
-      <w:r>
-        <w:rPr>
-          <w:rFonts w:cs="Arial" w:ascii="Arial" w:hAnsi="Arial"/>
-        </w:rPr>
-        <w:t xml:space="preserve"> (Fig. 3A). </w:t>
-      </w:r>
-    </w:p>
-    <w:p>
-      <w:pPr>
-        <w:pStyle w:val="Heading4"/>
-        <w:rPr>
-          <w:rFonts w:ascii="Arial" w:hAnsi="Arial" w:cs="Arial"/>
-        </w:rPr>
-      </w:pPr>
-      <w:r>
-        <w:rPr>
-          <w:rFonts w:cs="Arial" w:ascii="Arial" w:hAnsi="Arial"/>
-        </w:rPr>
-        <w:t>3.1 Assessment Using Longitudinal Negative Control Survey</w:t>
-      </w:r>
-    </w:p>
-    <w:p>
-      <w:pPr>
-        <w:pStyle w:val="BodyText"/>
-        <w:spacing w:lineRule="auto" w:line="480"/>
-        <w:jc w:val="both"/>
-        <w:rPr>
-          <w:rFonts w:ascii="Arial" w:hAnsi="Arial" w:cs="Arial"/>
-        </w:rPr>
-      </w:pPr>
-      <w:r>
-        <w:rPr>
-          <w:rFonts w:cs="Arial" w:ascii="Arial" w:hAnsi="Arial"/>
-        </w:rPr>
-        <w:t>In the first approach, we leverage the longitudinal contamination survey described above as a lab-specific contamination background (CB) for the assessment. Specifically, a bacterial profile, before (non-decontaminated samples, ND) or after a certain decontamination, along with CB will be used to calculate a corresponding composite score which simultaneously rewards the removal of contaminant species in CB while prevent</w:t>
-      </w:r>
-      <w:ins w:id="38" w:author="adm_neesse" w:date="2026-08-01T09:41:00Z">
+      <w:del w:id="23" w:author="Linh Dang" w:date="2026-08-07T16:23:11Z">
         <w:r>
           <w:rPr>
             <w:rFonts w:cs="Arial" w:ascii="Arial" w:hAnsi="Arial"/>
           </w:rPr>
-          <w:t>ing</w:t>
+          <w:delText xml:space="preserve"> and total abundance cutoff of 1*10</w:delText>
         </w:r>
-      </w:ins>
-      <w:del w:id="39" w:author="adm_neesse" w:date="2026-08-01T09:41:00Z">
+      </w:del>
+      <w:del w:id="24" w:author="Linh Dang" w:date="2026-08-07T16:23:11Z">
+        <w:r>
+          <w:rPr>
+            <w:rFonts w:cs="Arial" w:ascii="Arial" w:hAnsi="Arial"/>
+            <w:vertAlign w:val="superscript"/>
+          </w:rPr>
+          <w:delText>-4</w:delText>
+        </w:r>
+      </w:del>
+      <w:del w:id="25" w:author="Linh Dang" w:date="2026-08-07T16:23:11Z">
         <w:r>
           <w:rPr>
             <w:rFonts w:cs="Arial" w:ascii="Arial" w:hAnsi="Arial"/>
           </w:rPr>
-          <w:delText>s</w:delText>
+          <w:delText>, and we aggregate data into genus rank level. The SCRuB method showed highly variable results, with a few samples exhibiting exceptionally high overlap ratios while the rest were very low. In contrast, the Nj method showed the smallest variation among methods and produced significantly higher overlap ratios than all others (Table S10).</w:delText>
         </w:r>
       </w:del>
-      <w:r>
-        <w:rPr>
-          <w:rFonts w:cs="Arial" w:ascii="Arial" w:hAnsi="Arial"/>
-        </w:rPr>
-        <w:t xml:space="preserve"> the excessive removal of the true taxa. </w:t>
+    </w:p>
+    <w:p>
+      <w:pPr>
+        <w:pStyle w:val="Heading4"/>
+        <w:rPr>
+          <w:rFonts w:ascii="Arial" w:hAnsi="Arial" w:cs="Arial"/>
+        </w:rPr>
+      </w:pPr>
+      <w:r>
+        <w:rPr>
+          <w:rFonts w:cs="Arial" w:ascii="Arial" w:hAnsi="Arial"/>
+        </w:rPr>
+        <w:t>3.3 Technical replicates with decontamination method reveals reliable intratumoral bacterial profile in fresh-frozen samples from pancreatic ductal adenocarcinoma</w:t>
       </w:r>
     </w:p>
     <w:p>
@@ -2535,37 +2532,62 @@
         <w:rPr>
           <w:rFonts w:cs="Arial" w:ascii="Arial" w:hAnsi="Arial"/>
         </w:rPr>
-        <w:t xml:space="preserve">The Nj method achieved the highest composite score, significantly outperforming all alternatives on species level (Fig. 3B, Table S8). ND data scored lower than Nj, restrictive, and decontam method. Interestingly, the composite score from SCRuB is the smallest, even significantly smaller than ND. </w:t>
-      </w:r>
-    </w:p>
-    <w:p>
-      <w:pPr>
-        <w:pStyle w:val="Heading4"/>
-        <w:rPr>
-          <w:rFonts w:ascii="Arial" w:hAnsi="Arial" w:cs="Arial"/>
-        </w:rPr>
-      </w:pPr>
-      <w:r>
-        <w:rPr>
-          <w:rFonts w:cs="Arial" w:ascii="Arial" w:hAnsi="Arial"/>
-        </w:rPr>
-        <w:t>3.2 Assessment Using Technical Replicates</w:t>
-      </w:r>
-    </w:p>
-    <w:p>
-      <w:pPr>
-        <w:pStyle w:val="FirstParagraph"/>
-        <w:spacing w:lineRule="auto" w:line="480"/>
-        <w:jc w:val="both"/>
-        <w:rPr>
-          <w:rFonts w:ascii="Arial" w:hAnsi="Arial" w:cs="Arial"/>
-        </w:rPr>
-      </w:pPr>
-      <w:r>
-        <w:rPr>
-          <w:rFonts w:cs="Arial" w:ascii="Arial" w:hAnsi="Arial"/>
-        </w:rPr>
-        <w:t>To provide an orthogonal validation, we re-sequenced ten FF tumors from KPC mice as technical replicates more than two years after initial sequencing from a different LP to control for the batch effect. Our underlying assumption was that decontaminated profiles, should exhibit greater concordance between replicates from the same tumor sample than the technical replicates without decontamination (ND).</w:t>
+        <w:t xml:space="preserve">Next, we investigate the actual microbial composition after different decontamination approaches to evaluate the biological origin of respective genera. In the ND profile, samples were dominated by environmental contaminants. </w:t>
+      </w:r>
+      <w:r>
+        <w:rPr>
+          <w:rFonts w:cs="Arial" w:ascii="Arial" w:hAnsi="Arial"/>
+          <w:i/>
+          <w:iCs/>
+        </w:rPr>
+        <w:t>Sphingomonas</w:t>
+      </w:r>
+      <w:r>
+        <w:rPr>
+          <w:rFonts w:cs="Arial" w:ascii="Arial" w:hAnsi="Arial"/>
+        </w:rPr>
+        <w:t xml:space="preserve"> predominated in the first replicate of several samples, while </w:t>
+      </w:r>
+      <w:r>
+        <w:rPr>
+          <w:rFonts w:cs="Arial" w:ascii="Arial" w:hAnsi="Arial"/>
+          <w:i/>
+          <w:iCs/>
+        </w:rPr>
+        <w:t>Caldibacillus</w:t>
+      </w:r>
+      <w:r>
+        <w:rPr>
+          <w:rFonts w:cs="Arial" w:ascii="Arial" w:hAnsi="Arial"/>
+        </w:rPr>
+        <w:t xml:space="preserve"> was prominent in the second replicate of others (Fig. 3E). Both genera are considered as environmental taxa rather than mammal commensal. These taxa were largely eliminated following decontamination, though performance varied by methods. The decontam method failed to remove </w:t>
+      </w:r>
+      <w:r>
+        <w:rPr>
+          <w:rFonts w:cs="Arial" w:ascii="Arial" w:hAnsi="Arial"/>
+          <w:i/>
+        </w:rPr>
+        <w:t>Caldibacillus</w:t>
+      </w:r>
+      <w:r>
+        <w:rPr>
+          <w:rFonts w:cs="Arial" w:ascii="Arial" w:hAnsi="Arial"/>
+        </w:rPr>
+        <w:t xml:space="preserve"> in one replicate, though taking the overlap across replicates substantially reduced its abundance, supporting the use of replicate overlap as a conservative estimate of the true bacterial composition (Fig. 3E). A simple taxon-removal strategy based solely on NCT samples, namely the restrictive method, likewise failed to remove contaminants such as </w:t>
+      </w:r>
+      <w:r>
+        <w:rPr>
+          <w:rFonts w:cs="Arial" w:ascii="Arial" w:hAnsi="Arial"/>
+          <w:i/>
+          <w:iCs/>
+        </w:rPr>
+        <w:t>Cloacibacterium</w:t>
+      </w:r>
+      <w:r>
+        <w:rPr>
+          <w:rFonts w:cs="Arial" w:ascii="Arial" w:hAnsi="Arial"/>
+        </w:rPr>
+        <w:t>. By contrast, Nj and SCRuB yielded similar, more robust compositional profiles.</w:t>
       </w:r>
     </w:p>
     <w:p>
@@ -2581,160 +2603,7 @@
         <w:rPr>
           <w:rFonts w:cs="Arial" w:ascii="Arial" w:hAnsi="Arial"/>
         </w:rPr>
-        <w:t>Inter-replicate dissimilarity was quantified using Aitchison distance of centered-log ratio transformed data, with pairwise comparisons assessed by paired Wilcoxon signed-rank test on species level. The Nj method obtained the smallest inter-replicate distances, indicating superior</w:t>
-      </w:r>
-      <w:ins w:id="40" w:author="adm_neesse" w:date="2026-08-01T09:43:00Z">
-        <w:r>
-          <w:rPr>
-            <w:rFonts w:cs="Arial" w:ascii="Arial" w:hAnsi="Arial"/>
-          </w:rPr>
-          <w:t>ity</w:t>
-        </w:r>
-      </w:ins>
-      <w:r>
-        <w:rPr>
-          <w:rFonts w:cs="Arial" w:ascii="Arial" w:hAnsi="Arial"/>
-        </w:rPr>
-        <w:t xml:space="preserve"> within sample consistency (Fig. 3C, Table S9). Consistently, inter-replicate among ND samples showed the highest scores, indicating </w:t>
-      </w:r>
-      <w:ins w:id="41" w:author="adm_neesse" w:date="2026-08-01T09:43:00Z">
-        <w:r>
-          <w:rPr>
-            <w:rFonts w:cs="Arial" w:ascii="Arial" w:hAnsi="Arial"/>
-          </w:rPr>
-          <w:t xml:space="preserve">the </w:t>
-        </w:r>
-      </w:ins>
-      <w:r>
-        <w:rPr>
-          <w:rFonts w:cs="Arial" w:ascii="Arial" w:hAnsi="Arial"/>
-        </w:rPr>
-        <w:t xml:space="preserve">suspected batch effect. </w:t>
-      </w:r>
-    </w:p>
-    <w:p>
-      <w:pPr>
-        <w:pStyle w:val="BodyText"/>
-        <w:spacing w:lineRule="auto" w:line="480"/>
-        <w:jc w:val="both"/>
-        <w:rPr>
-          <w:rFonts w:ascii="Arial" w:hAnsi="Arial" w:cs="Arial"/>
-        </w:rPr>
-      </w:pPr>
-      <w:r>
-        <w:rPr>
-          <w:rFonts w:cs="Arial" w:ascii="Arial" w:hAnsi="Arial"/>
-        </w:rPr>
-        <w:t xml:space="preserve">We also validated the results with other distance metric such as unweighted Jaccard </w:t>
-      </w:r>
-      <w:ins w:id="42" w:author="adm_neesse" w:date="2026-08-01T09:44:00Z">
-        <w:r>
-          <w:rPr>
-            <w:rFonts w:cs="Arial" w:ascii="Arial" w:hAnsi="Arial"/>
-          </w:rPr>
-          <w:t>showing</w:t>
-        </w:r>
-      </w:ins>
-      <w:del w:id="43" w:author="adm_neesse" w:date="2026-08-01T09:44:00Z">
-        <w:r>
-          <w:rPr>
-            <w:rFonts w:cs="Arial" w:ascii="Arial" w:hAnsi="Arial"/>
-          </w:rPr>
-          <w:delText>result in</w:delText>
-        </w:r>
-      </w:del>
-      <w:r>
-        <w:rPr>
-          <w:rFonts w:cs="Arial" w:ascii="Arial" w:hAnsi="Arial"/>
-        </w:rPr>
-        <w:t xml:space="preserve"> </w:t>
-      </w:r>
-      <w:ins w:id="44" w:author="adm_neesse" w:date="2026-08-01T09:44:00Z">
-        <w:r>
-          <w:rPr>
-            <w:rFonts w:cs="Arial" w:ascii="Arial" w:hAnsi="Arial"/>
-          </w:rPr>
-          <w:t xml:space="preserve">a </w:t>
-        </w:r>
-      </w:ins>
-      <w:r>
-        <w:rPr>
-          <w:rFonts w:cs="Arial" w:ascii="Arial" w:hAnsi="Arial"/>
-        </w:rPr>
-        <w:t>similar pattern (Fig. S2).</w:t>
-      </w:r>
-    </w:p>
-    <w:p>
-      <w:pPr>
-        <w:pStyle w:val="BodyText"/>
-        <w:spacing w:lineRule="auto" w:line="480"/>
-        <w:jc w:val="both"/>
-        <w:rPr>
-          <w:rFonts w:ascii="Arial" w:hAnsi="Arial" w:cs="Arial"/>
-        </w:rPr>
-      </w:pPr>
-      <w:r>
-        <w:rPr>
-          <w:rFonts w:cs="Arial" w:ascii="Arial" w:hAnsi="Arial"/>
-        </w:rPr>
-        <w:t>Furthermore, compositional overlap between non-normalized replicates, measured as the proportion of shared taxa out of total detected taxa between two replicates, was also highest for Nj method (Fig. 3D). This measurement estimates the robustness of decontamination procedures. Notably, we excluded the extremely rare taxa by applying a prevalence threshold of at least two out of ten</w:t>
-      </w:r>
-      <w:ins w:id="45" w:author="adm_neesse" w:date="2026-08-01T09:44:00Z">
-        <w:r>
-          <w:rPr>
-            <w:rFonts w:cs="Arial" w:ascii="Arial" w:hAnsi="Arial"/>
-          </w:rPr>
-          <w:t>,</w:t>
-        </w:r>
-      </w:ins>
-      <w:r>
-        <w:rPr>
-          <w:rFonts w:cs="Arial" w:ascii="Arial" w:hAnsi="Arial"/>
-        </w:rPr>
-        <w:t xml:space="preserve"> and total abundance cutoff of 1*10</w:t>
-      </w:r>
-      <w:r>
-        <w:rPr>
-          <w:rFonts w:cs="Arial" w:ascii="Arial" w:hAnsi="Arial"/>
-          <w:vertAlign w:val="superscript"/>
-        </w:rPr>
-        <w:t>-4</w:t>
-      </w:r>
-      <w:r>
-        <w:rPr>
-          <w:rFonts w:cs="Arial" w:ascii="Arial" w:hAnsi="Arial"/>
-        </w:rPr>
-        <w:t>, and we aggregate data into genus rank level. The SCRuB method showed highly variable results, with a few samples exhibiting exceptionally high overlap ratios while the rest were very low. In contrast, the Nj method showed the smallest variation among methods and produced significantly higher overlap ratios than all others (Table S10).</w:t>
-      </w:r>
-    </w:p>
-    <w:p>
-      <w:pPr>
-        <w:pStyle w:val="Heading4"/>
-        <w:rPr>
-          <w:rFonts w:ascii="Arial" w:hAnsi="Arial" w:cs="Arial"/>
-        </w:rPr>
-      </w:pPr>
-      <w:r>
-        <w:rPr>
-          <w:rFonts w:cs="Arial" w:ascii="Arial" w:hAnsi="Arial"/>
-        </w:rPr>
-        <w:t>3.3 Technical replicates with decontamination method reveals reliable intratumoral bacterial profile in fresh-frozen samples from pancreatic ductal adenocarcinoma</w:t>
-      </w:r>
-    </w:p>
-    <w:p>
-      <w:pPr>
-        <w:pStyle w:val="BodyText"/>
-        <w:spacing w:lineRule="auto" w:line="480"/>
-        <w:jc w:val="both"/>
-        <w:rPr>
-          <w:rFonts w:ascii="Arial" w:hAnsi="Arial" w:cs="Arial"/>
-        </w:rPr>
-      </w:pPr>
-      <w:r>
-        <w:rPr>
-          <w:rFonts w:cs="Arial" w:ascii="Arial" w:hAnsi="Arial"/>
-        </w:rPr>
-        <w:t xml:space="preserve">Next, we investigate the actual microbial composition after different decontamination approaches to evaluate the biological origin of respective genera. In the ND profile, samples were dominated by environmental contaminants. </w:t>
+        <w:t xml:space="preserve">Following Nj decontamination, the majority of remained bacteria belonged to genera with plausible biological relevance to PDAC, including </w:t>
       </w:r>
       <w:r>
         <w:rPr>
@@ -2742,13 +2611,13 @@
           <w:i/>
           <w:iCs/>
         </w:rPr>
-        <w:t>Sphingomonas</w:t>
-      </w:r>
-      <w:r>
-        <w:rPr>
-          <w:rFonts w:cs="Arial" w:ascii="Arial" w:hAnsi="Arial"/>
-        </w:rPr>
-        <w:t xml:space="preserve"> predominated in the first replicate of several samples, while </w:t>
+        <w:t>Ligilactobacillus</w:t>
+      </w:r>
+      <w:r>
+        <w:rPr>
+          <w:rFonts w:cs="Arial" w:ascii="Arial" w:hAnsi="Arial"/>
+        </w:rPr>
+        <w:t xml:space="preserve">, </w:t>
       </w:r>
       <w:r>
         <w:rPr>
@@ -2756,26 +2625,13 @@
           <w:i/>
           <w:iCs/>
         </w:rPr>
-        <w:t>Caldibacillus</w:t>
-      </w:r>
-      <w:r>
-        <w:rPr>
-          <w:rFonts w:cs="Arial" w:ascii="Arial" w:hAnsi="Arial"/>
-        </w:rPr>
-        <w:t xml:space="preserve"> was prominent in the second replicate of others (Fig. 3E). Both genera are considered as environmental taxa rather than mammal commensal. These taxa were largely eliminated following decontamination, though performance varied by methods. The decontam method failed to remove </w:t>
-      </w:r>
-      <w:r>
-        <w:rPr>
-          <w:rFonts w:cs="Arial" w:ascii="Arial" w:hAnsi="Arial"/>
-          <w:i/>
-        </w:rPr>
-        <w:t>Caldibacillus</w:t>
-      </w:r>
-      <w:r>
-        <w:rPr>
-          <w:rFonts w:cs="Arial" w:ascii="Arial" w:hAnsi="Arial"/>
-        </w:rPr>
-        <w:t xml:space="preserve"> in one replicate, though taking the overlap across replicates substantially reduced its abundance, supporting the use of replicate overlap as a conservative estimate of the true bacterial composition (Fig. 3E). A simple taxon-removal strategy based solely on NCT samples, namely the restrictive method, likewise failed to remove contaminants such as </w:t>
+        <w:t>Escherichia</w:t>
+      </w:r>
+      <w:r>
+        <w:rPr>
+          <w:rFonts w:cs="Arial" w:ascii="Arial" w:hAnsi="Arial"/>
+        </w:rPr>
+        <w:t xml:space="preserve">, </w:t>
       </w:r>
       <w:r>
         <w:rPr>
@@ -2783,29 +2639,13 @@
           <w:i/>
           <w:iCs/>
         </w:rPr>
-        <w:t>Cloacibacterium</w:t>
-      </w:r>
-      <w:r>
-        <w:rPr>
-          <w:rFonts w:cs="Arial" w:ascii="Arial" w:hAnsi="Arial"/>
-        </w:rPr>
-        <w:t>. By contrast, Nj and SCRuB yielded similar, more robust compositional profiles.</w:t>
-      </w:r>
-    </w:p>
-    <w:p>
-      <w:pPr>
-        <w:pStyle w:val="BodyText"/>
-        <w:spacing w:lineRule="auto" w:line="480"/>
-        <w:jc w:val="both"/>
-        <w:rPr>
-          <w:rFonts w:ascii="Arial" w:hAnsi="Arial" w:cs="Arial"/>
-        </w:rPr>
-      </w:pPr>
-      <w:r>
-        <w:rPr>
-          <w:rFonts w:cs="Arial" w:ascii="Arial" w:hAnsi="Arial"/>
-        </w:rPr>
-        <w:t xml:space="preserve">Following Nj decontamination, the majority of remained bacteria belonged to genera with plausible biological relevance to PDAC, including </w:t>
+        <w:t>Alistipes</w:t>
+      </w:r>
+      <w:r>
+        <w:rPr>
+          <w:rFonts w:cs="Arial" w:ascii="Arial" w:hAnsi="Arial"/>
+        </w:rPr>
+        <w:t xml:space="preserve">, and </w:t>
       </w:r>
       <w:r>
         <w:rPr>
@@ -2813,48 +2653,6 @@
           <w:i/>
           <w:iCs/>
         </w:rPr>
-        <w:t>Ligilactobacillus</w:t>
-      </w:r>
-      <w:r>
-        <w:rPr>
-          <w:rFonts w:cs="Arial" w:ascii="Arial" w:hAnsi="Arial"/>
-        </w:rPr>
-        <w:t xml:space="preserve">, </w:t>
-      </w:r>
-      <w:r>
-        <w:rPr>
-          <w:rFonts w:cs="Arial" w:ascii="Arial" w:hAnsi="Arial"/>
-          <w:i/>
-          <w:iCs/>
-        </w:rPr>
-        <w:t>Escherichia</w:t>
-      </w:r>
-      <w:r>
-        <w:rPr>
-          <w:rFonts w:cs="Arial" w:ascii="Arial" w:hAnsi="Arial"/>
-        </w:rPr>
-        <w:t xml:space="preserve">, </w:t>
-      </w:r>
-      <w:r>
-        <w:rPr>
-          <w:rFonts w:cs="Arial" w:ascii="Arial" w:hAnsi="Arial"/>
-          <w:i/>
-          <w:iCs/>
-        </w:rPr>
-        <w:t>Alistipes</w:t>
-      </w:r>
-      <w:r>
-        <w:rPr>
-          <w:rFonts w:cs="Arial" w:ascii="Arial" w:hAnsi="Arial"/>
-        </w:rPr>
-        <w:t xml:space="preserve">, and </w:t>
-      </w:r>
-      <w:r>
-        <w:rPr>
-          <w:rFonts w:cs="Arial" w:ascii="Arial" w:hAnsi="Arial"/>
-          <w:i/>
-          <w:iCs/>
-        </w:rPr>
         <w:t xml:space="preserve">Bacteroides, </w:t>
       </w:r>
       <w:r>
@@ -2863,7 +2661,7 @@
         </w:rPr>
         <w:t xml:space="preserve">common gut commensals, that may migrate directly into the tumor microenvironment, as described </w:t>
       </w:r>
-      <w:ins w:id="46" w:author="adm_neesse" w:date="2026-08-01T09:46:00Z">
+      <w:ins w:id="26" w:author="adm_neesse" w:date="2026-08-01T09:46:00Z">
         <w:r>
           <w:rPr>
             <w:rFonts w:cs="Arial" w:ascii="Arial" w:hAnsi="Arial"/>
@@ -2871,7 +2669,7 @@
           <w:t>by</w:t>
         </w:r>
       </w:ins>
-      <w:del w:id="47" w:author="adm_neesse" w:date="2026-08-01T09:46:00Z">
+      <w:del w:id="27" w:author="adm_neesse" w:date="2026-08-01T09:46:00Z">
         <w:r>
           <w:rPr>
             <w:rFonts w:cs="Arial" w:ascii="Arial" w:hAnsi="Arial"/>
@@ -4951,14 +4749,14 @@
         <w:rPr>
           <w:rFonts w:cs="Arial" w:ascii="Arial" w:hAnsi="Arial"/>
         </w:rPr>
-        <w:t>genome of 13550 bacterial taxa, latest upda</w:t>
+        <w:t>genome of 13550 bacterial taxa, latest upd</w:t>
       </w:r>
       <w:bookmarkEnd w:id="4"/>
       <w:r>
         <w:rPr>
           <w:rFonts w:cs="Arial" w:ascii="Arial" w:hAnsi="Arial"/>
         </w:rPr>
-        <w:t>ted on December 2024.</w:t>
+        <w:t>ated on December 2024.</w:t>
       </w:r>
     </w:p>
     <w:p>
@@ -5214,10 +5012,10 @@
         <w:pStyle w:val="Heading3"/>
         <w:rPr>
           <w:rFonts w:ascii="Arial" w:hAnsi="Arial" w:cs="Arial"/>
-          <w:ins w:id="49" w:author="Linh Dang" w:date="2026-08-05T13:21:26Z"/>
-        </w:rPr>
-      </w:pPr>
-      <w:ins w:id="48" w:author="Linh Dang" w:date="2026-08-05T13:21:26Z">
+          <w:ins w:id="29" w:author="Linh Dang" w:date="2026-08-05T13:21:26Z"/>
+        </w:rPr>
+      </w:pPr>
+      <w:ins w:id="28" w:author="Linh Dang" w:date="2026-08-05T13:21:26Z">
         <w:r>
           <w:rPr>
             <w:rFonts w:cs="Arial" w:ascii="Arial" w:hAnsi="Arial"/>
@@ -5233,10 +5031,10 @@
         <w:jc w:val="both"/>
         <w:rPr>
           <w:rFonts w:ascii="Arial" w:hAnsi="Arial" w:cs="Arial"/>
-          <w:ins w:id="56" w:author="Linh Dang" w:date="2026-08-05T13:21:26Z"/>
-        </w:rPr>
-      </w:pPr>
-      <w:ins w:id="50" w:author="Linh Dang" w:date="2026-08-05T13:21:26Z">
+          <w:ins w:id="33" w:author="Linh Dang" w:date="2026-08-05T13:21:26Z"/>
+        </w:rPr>
+      </w:pPr>
+      <w:ins w:id="30" w:author="Linh Dang" w:date="2026-08-05T13:21:26Z">
         <w:r>
           <w:rPr>
             <w:rFonts w:cs="Arial" w:ascii="Arial" w:hAnsi="Arial"/>
@@ -5244,31 +5042,32 @@
           <w:t xml:space="preserve">18 fresh frozen tumor samples (FF) from KPC mice were sequenced, together with their corresponding negative controls (NCT). Non-decontaminated (ND) profile was decontaminated through four approaches: restrictive, decontam, SCRuB, and Nejman (Nj) et al derived method </w:t>
         </w:r>
       </w:ins>
-      <w:ins w:id="51" w:author="Linh Dang" w:date="2026-08-05T13:21:26Z">
-        <w:r>
-          <w:fldChar w:fldCharType="begin"/>
-        </w:r>
-        <w:r>
-          <w:rPr>
-            <w:rFonts w:cs="Arial" w:ascii="Arial" w:hAnsi="Arial"/>
-          </w:rPr>
-          <w:instrText xml:space="preserve">ADDIN CitaviPlaceholder{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}</w:instrText>
-        </w:r>
-      </w:ins>
-      <w:ins w:id="52" w:author="Linh Dang" w:date="2026-08-05T13:21:26Z">
-        <w:r>
-          <w:rPr>
-            <w:rFonts w:cs="Arial" w:ascii="Arial" w:hAnsi="Arial"/>
-          </w:rPr>
-        </w:r>
-      </w:ins>
+      <w:r>
+        <w:fldChar w:fldCharType="begin"/>
+      </w:r>
+      <w:r>
+        <w:rPr>
+          <w:rFonts w:cs="Arial" w:ascii="Arial" w:hAnsi="Arial"/>
+        </w:rPr>
+        <w:instrText xml:space="preserve">ADDIN CitaviPlaceholder{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}</w:instrText>
+      </w:r>
+      <w:r>
+        <w:rPr>
+          <w:rFonts w:cs="Arial" w:ascii="Arial" w:hAnsi="Arial"/>
+        </w:rPr>
+      </w:r>
       <w:r>
         <w:rPr>
           <w:rFonts w:cs="Arial" w:ascii="Arial" w:hAnsi="Arial"/>
         </w:rPr>
         <w:fldChar w:fldCharType="separate"/>
       </w:r>
-      <w:ins w:id="53" w:author="Linh Dang" w:date="2026-08-05T13:21:26Z">
+      <w:r>
+        <w:rPr>
+          <w:rFonts w:cs="Arial" w:ascii="Arial" w:hAnsi="Arial"/>
+        </w:rPr>
+      </w:r>
+      <w:ins w:id="31" w:author="Linh Dang" w:date="2026-08-05T13:21:26Z">
         <w:r>
           <w:rPr>
             <w:rFonts w:cs="Arial" w:ascii="Arial" w:hAnsi="Arial"/>
@@ -5276,20 +5075,18 @@
           <w:t>(6)</w:t>
         </w:r>
       </w:ins>
-      <w:ins w:id="54" w:author="Linh Dang" w:date="2026-08-05T13:21:26Z">
-        <w:r>
-          <w:rPr>
-            <w:rFonts w:cs="Arial" w:ascii="Arial" w:hAnsi="Arial"/>
-          </w:rPr>
-        </w:r>
-      </w:ins>
+      <w:r>
+        <w:rPr>
+          <w:rFonts w:cs="Arial" w:ascii="Arial" w:hAnsi="Arial"/>
+        </w:rPr>
+      </w:r>
       <w:r>
         <w:rPr>
           <w:rFonts w:cs="Arial" w:ascii="Arial" w:hAnsi="Arial"/>
         </w:rPr>
         <w:fldChar w:fldCharType="end"/>
       </w:r>
-      <w:ins w:id="55" w:author="Linh Dang" w:date="2026-08-05T13:21:26Z">
+      <w:ins w:id="32" w:author="Linh Dang" w:date="2026-08-05T13:21:26Z">
         <w:r>
           <w:rPr>
             <w:rFonts w:cs="Arial" w:ascii="Arial" w:hAnsi="Arial"/>
@@ -5350,14 +5147,14 @@
         <w:rPr>
           <w:rFonts w:cs="Arial" w:ascii="Arial" w:hAnsi="Arial"/>
         </w:rPr>
-        <w:t xml:space="preserve"> and Wrench method in R package (</w:t>
+        <w:t xml:space="preserve"> and Wrench method in R package </w:t>
       </w:r>
       <w:bookmarkEnd w:id="6"/>
       <w:r>
         <w:rPr>
           <w:rFonts w:cs="Arial" w:ascii="Arial" w:hAnsi="Arial"/>
         </w:rPr>
-        <w:t>8) for normalization.</w:t>
+        <w:t>(8) for normalization.</w:t>
       </w:r>
     </w:p>
     <w:p>
@@ -5406,182 +5203,404 @@
         <w:rPr>
           <w:rFonts w:cs="Arial" w:ascii="Arial" w:hAnsi="Arial"/>
         </w:rPr>
-        <w:t>In the murine PDAC FF study which comprises PDAC and corresponding negative control samples, we applied slightly different threshold for each category. For the PDAC true sample, we set the threshold for minimal total abundance as $1e-6$, while for their respectively negative control we reduce this threshold to $5e-7$, due to the assumption that the microbiome content in negative control is much sparer than in tumor sample. Detail and pseudo-code could be found in the technical supplementary file.</w:t>
-      </w:r>
-      <w:bookmarkEnd w:id="7"/>
-    </w:p>
-    <w:p>
-      <w:pPr>
-        <w:pStyle w:val="Heading3"/>
-        <w:spacing w:lineRule="auto" w:line="480"/>
-        <w:jc w:val="both"/>
-        <w:rPr>
-          <w:rFonts w:ascii="Arial" w:hAnsi="Arial" w:cs="Arial"/>
-        </w:rPr>
-      </w:pPr>
-      <w:r>
-        <w:rPr>
-          <w:rFonts w:cs="Arial" w:ascii="Arial" w:hAnsi="Arial"/>
-        </w:rPr>
-        <w:t>Statistical Analysis</w:t>
-      </w:r>
-    </w:p>
-    <w:p>
-      <w:pPr>
-        <w:pStyle w:val="FirstParagraph"/>
-        <w:spacing w:lineRule="auto" w:line="480"/>
-        <w:jc w:val="both"/>
-        <w:rPr>
-          <w:rFonts w:ascii="Arial" w:hAnsi="Arial" w:cs="Arial"/>
-        </w:rPr>
-      </w:pPr>
-      <w:r>
-        <w:rPr>
-          <w:rFonts w:cs="Arial" w:ascii="Arial" w:hAnsi="Arial"/>
-        </w:rPr>
-        <w:t>In the contamination survey and negative sequencing in different environments, we applied t-test and PERNOVA test along with alpha and beta analysis respectively. Multiple testing correction is Benjamini-Hochberg procedure.</w:t>
-      </w:r>
-    </w:p>
-    <w:p>
-      <w:pPr>
-        <w:pStyle w:val="BodyText"/>
-        <w:spacing w:lineRule="auto" w:line="480"/>
-        <w:jc w:val="both"/>
-        <w:rPr>
-          <w:rFonts w:ascii="Arial" w:hAnsi="Arial" w:cs="Arial"/>
-        </w:rPr>
-      </w:pPr>
-      <w:bookmarkStart w:id="8" w:name="statistical-analysis"/>
-      <w:r>
-        <w:rPr>
-          <w:rFonts w:cs="Arial" w:ascii="Arial" w:hAnsi="Arial"/>
-        </w:rPr>
-        <w:t>In the murine PDAC samples study, we applied either paired Wilcoxon signed rank test or linear mixed model with random effect to evaluate various decontamination methods. Multiple testing correction is Benjamini-Hochberg.</w:t>
-      </w:r>
-      <w:bookmarkEnd w:id="8"/>
-    </w:p>
-    <w:p>
-      <w:pPr>
-        <w:pStyle w:val="Heading3"/>
-        <w:spacing w:lineRule="auto" w:line="480"/>
-        <w:jc w:val="both"/>
-        <w:rPr>
-          <w:rFonts w:ascii="Arial" w:hAnsi="Arial" w:cs="Arial"/>
-        </w:rPr>
-      </w:pPr>
-      <w:r>
-        <w:rPr>
-          <w:rFonts w:cs="Arial" w:ascii="Arial" w:hAnsi="Arial"/>
-        </w:rPr>
-        <w:t>Decontamination Methods</w:t>
-      </w:r>
-    </w:p>
-    <w:p>
-      <w:pPr>
-        <w:pStyle w:val="FirstParagraph"/>
-        <w:spacing w:lineRule="auto" w:line="480"/>
-        <w:jc w:val="both"/>
-        <w:rPr>
-          <w:rFonts w:ascii="Arial" w:hAnsi="Arial" w:cs="Arial"/>
-        </w:rPr>
-      </w:pPr>
-      <w:bookmarkStart w:id="9" w:name="decontamination-methods"/>
-      <w:r>
-        <w:rPr>
-          <w:rFonts w:cs="Arial" w:ascii="Arial" w:hAnsi="Arial"/>
-        </w:rPr>
-        <w:t xml:space="preserve">Four decontamination approaches were evaluated: (1) Restrictive filtering: taxa detected in any </w:t>
-      </w:r>
-      <w:commentRangeStart w:id="6"/>
-      <w:r>
-        <w:rPr>
-          <w:rFonts w:cs="Arial" w:ascii="Arial" w:hAnsi="Arial"/>
-        </w:rPr>
-        <w:t>NCT samples were excluded from further analyses; (2) Decontam (6): probability-based classification of contaminant taxa using negative control prevalence; (3) SCRuB (2): source tracking-based contaminant removal; and (4) Nejman et. al. procedure (7): the decontamination strategy incorporating multiple filtering criteria. Notbly, instead of binomial testing as Nejman et al. described in (7), we applied Fisher test instead due to small number of samples and negative controls. The implementation of those four decontamination methods is available in the github repository</w:t>
-      </w:r>
-      <w:bookmarkEnd w:id="9"/>
-      <w:r>
-        <w:rPr>
-          <w:rFonts w:cs="Arial" w:ascii="Arial" w:hAnsi="Arial"/>
-        </w:rPr>
-      </w:r>
-      <w:commentRangeEnd w:id="6"/>
-      <w:r>
-        <w:commentReference w:id="6"/>
-      </w:r>
-      <w:r>
-        <w:rPr>
-          <w:rFonts w:cs="Arial" w:ascii="Arial" w:hAnsi="Arial"/>
-        </w:rPr>
-        <w:t>.</w:t>
-      </w:r>
-    </w:p>
-    <w:p>
-      <w:pPr>
-        <w:pStyle w:val="Heading3"/>
-        <w:spacing w:lineRule="auto" w:line="480"/>
-        <w:jc w:val="both"/>
-        <w:rPr>
-          <w:rFonts w:ascii="Arial" w:hAnsi="Arial" w:cs="Arial"/>
-        </w:rPr>
-      </w:pPr>
-      <w:r>
-        <w:rPr>
-          <w:rFonts w:cs="Arial" w:ascii="Arial" w:hAnsi="Arial"/>
-        </w:rPr>
-        <w:t>Composite Score</w:t>
-      </w:r>
-    </w:p>
-    <w:p>
-      <w:pPr>
-        <w:pStyle w:val="FirstParagraph"/>
-        <w:spacing w:lineRule="auto" w:line="480"/>
-        <w:jc w:val="both"/>
-        <w:rPr>
-          <w:rFonts w:ascii="Arial" w:hAnsi="Arial" w:cs="Arial"/>
-        </w:rPr>
-      </w:pPr>
-      <w:bookmarkStart w:id="10" w:name="materials-and-methods"/>
-      <w:bookmarkStart w:id="11" w:name="composite-score"/>
-      <w:r>
-        <w:rPr>
-          <w:rFonts w:cs="Arial" w:ascii="Arial" w:hAnsi="Arial"/>
-        </w:rPr>
-        <w:t>Composite score is calculated from the bacterial profile after or before decontamination and the longitudinal contaminant survey. This score comprised of two parts: yield and purity. Yield is an entity quantifying the percentage of number of putative true taxa not overlap with NCT survey over number of total observed taxa, while the purity calculates the fraction between the same nominator over the number of putative true taxa from a certain decontamination method. The technical detail of the calculation could be found at Supplementary.</w:t>
-      </w:r>
-      <w:bookmarkEnd w:id="10"/>
-      <w:bookmarkEnd w:id="11"/>
-    </w:p>
-    <w:p>
-      <w:pPr>
-        <w:pStyle w:val="Heading3"/>
-        <w:spacing w:lineRule="auto" w:line="480"/>
-        <w:jc w:val="both"/>
-        <w:rPr>
-          <w:rFonts w:ascii="Arial" w:hAnsi="Arial" w:cs="Arial"/>
-          <w:ins w:id="58" w:author="Linh Dang" w:date="2026-08-05T14:07:10Z"/>
-        </w:rPr>
-      </w:pPr>
-      <w:ins w:id="57" w:author="Linh Dang" w:date="2026-08-05T14:07:10Z">
+        <w:t xml:space="preserve">In the murine PDAC FF study which comprises PDAC and corresponding negative control samples, we applied slightly different threshold for each category. For the PDAC true sample, we set the threshold for minimal total abundance as </w:t>
+      </w:r>
+      <w:r>
+        <w:rPr>
+          <w:rFonts w:cs="Arial" w:ascii="Arial" w:hAnsi="Arial"/>
+        </w:rPr>
+      </w:r>
+      <m:oMath xmlns:m="http://schemas.openxmlformats.org/officeDocument/2006/math">
+        <m:r>
+          <w:rPr>
+            <w:rFonts w:ascii="Cambria Math" w:hAnsi="Cambria Math"/>
+          </w:rPr>
+          <m:t xml:space="preserve">1e-6</m:t>
+        </m:r>
+      </m:oMath>
+      <w:del w:id="34" w:author="Linh Dang" w:date="2026-08-07T11:43:09Z">
         <w:r>
           <w:rPr>
             <w:rFonts w:cs="Arial" w:ascii="Arial" w:hAnsi="Arial"/>
           </w:rPr>
-          <w:t>Inter-replicate Distance</w:t>
+          <w:delText>$1e-6$</w:delText>
+        </w:r>
+      </w:del>
+      <w:r>
+        <w:rPr>
+          <w:rFonts w:cs="Arial" w:ascii="Arial" w:hAnsi="Arial"/>
+        </w:rPr>
+        <w:t xml:space="preserve">, while for their respectively negative control we reduce this threshold to </w:t>
+      </w:r>
+      <w:r>
+        <w:rPr>
+          <w:rFonts w:cs="Arial" w:ascii="Arial" w:hAnsi="Arial"/>
+        </w:rPr>
+      </w:r>
+      <m:oMath xmlns:m="http://schemas.openxmlformats.org/officeDocument/2006/math">
+        <m:r>
+          <w:rPr>
+            <w:rFonts w:ascii="Cambria Math" w:hAnsi="Cambria Math"/>
+          </w:rPr>
+          <m:t xml:space="preserve">5e-7</m:t>
+        </m:r>
+      </m:oMath>
+      <w:del w:id="35" w:author="Linh Dang" w:date="2026-08-07T11:43:40Z">
+        <w:r>
+          <w:rPr>
+            <w:rFonts w:cs="Arial" w:ascii="Arial" w:hAnsi="Arial"/>
+          </w:rPr>
+          <w:delText>$5e-7$</w:delText>
+        </w:r>
+      </w:del>
+      <w:r>
+        <w:rPr>
+          <w:rFonts w:cs="Arial" w:ascii="Arial" w:hAnsi="Arial"/>
+        </w:rPr>
+        <w:t>, due to the assumption that the microbiome content in negative control is much sparer than in tumor sample. Detail and pseudo-code could be found in the technical supplementary file.</w:t>
+      </w:r>
+      <w:bookmarkEnd w:id="7"/>
+    </w:p>
+    <w:p>
+      <w:pPr>
+        <w:pStyle w:val="Heading3"/>
+        <w:spacing w:lineRule="auto" w:line="480"/>
+        <w:jc w:val="both"/>
+        <w:rPr>
+          <w:rFonts w:ascii="Arial" w:hAnsi="Arial" w:cs="Arial"/>
+        </w:rPr>
+      </w:pPr>
+      <w:r>
+        <w:rPr>
+          <w:rFonts w:cs="Arial" w:ascii="Arial" w:hAnsi="Arial"/>
+        </w:rPr>
+        <w:t>Statistical Analysis</w:t>
+      </w:r>
+    </w:p>
+    <w:p>
+      <w:pPr>
+        <w:pStyle w:val="FirstParagraph"/>
+        <w:spacing w:lineRule="auto" w:line="480"/>
+        <w:jc w:val="both"/>
+        <w:rPr>
+          <w:rFonts w:ascii="Arial" w:hAnsi="Arial" w:cs="Arial"/>
+        </w:rPr>
+      </w:pPr>
+      <w:r>
+        <w:rPr>
+          <w:rFonts w:cs="Arial" w:ascii="Arial" w:hAnsi="Arial"/>
+        </w:rPr>
+        <w:t>In the contamination survey and negative sequencing in different environments, we applied t-test and PERNOVA test along with alpha and beta analysis respectively. Multiple testing correction is Benjamini-Hochberg procedure.</w:t>
+      </w:r>
+    </w:p>
+    <w:p>
+      <w:pPr>
+        <w:pStyle w:val="BodyText"/>
+        <w:spacing w:lineRule="auto" w:line="480"/>
+        <w:jc w:val="both"/>
+        <w:rPr>
+          <w:rFonts w:ascii="Arial" w:hAnsi="Arial" w:cs="Arial"/>
+        </w:rPr>
+      </w:pPr>
+      <w:bookmarkStart w:id="8" w:name="statistical-analysis"/>
+      <w:r>
+        <w:rPr>
+          <w:rFonts w:cs="Arial" w:ascii="Arial" w:hAnsi="Arial"/>
+        </w:rPr>
+        <w:t>In the murine PDAC samples study, we applied either paired Wilcoxon signed rank test or linear mixed model with random effect to evaluate various decontamination methods. Multiple testing correction is Benjamini-Hochberg.</w:t>
+      </w:r>
+      <w:bookmarkEnd w:id="8"/>
+    </w:p>
+    <w:p>
+      <w:pPr>
+        <w:pStyle w:val="Heading3"/>
+        <w:spacing w:lineRule="auto" w:line="480"/>
+        <w:jc w:val="both"/>
+        <w:rPr>
+          <w:rFonts w:ascii="Arial" w:hAnsi="Arial" w:cs="Arial"/>
+        </w:rPr>
+      </w:pPr>
+      <w:r>
+        <w:rPr>
+          <w:rFonts w:cs="Arial" w:ascii="Arial" w:hAnsi="Arial"/>
+        </w:rPr>
+        <w:t>Decontamination Methods</w:t>
+      </w:r>
+    </w:p>
+    <w:p>
+      <w:pPr>
+        <w:pStyle w:val="FirstParagraph"/>
+        <w:spacing w:lineRule="auto" w:line="480"/>
+        <w:jc w:val="both"/>
+        <w:rPr>
+          <w:rFonts w:ascii="Arial" w:hAnsi="Arial" w:cs="Arial"/>
+        </w:rPr>
+      </w:pPr>
+      <w:bookmarkStart w:id="9" w:name="decontamination-methods"/>
+      <w:r>
+        <w:rPr>
+          <w:rFonts w:cs="Arial" w:ascii="Arial" w:hAnsi="Arial"/>
+        </w:rPr>
+        <w:t>Four decontamination approaches were evaluated: (</w:t>
+      </w:r>
+      <w:ins w:id="36" w:author="Linh Dang" w:date="2026-08-07T15:26:07Z">
+        <w:r>
+          <w:rPr>
+            <w:rFonts w:cs="Arial" w:ascii="Arial" w:hAnsi="Arial"/>
+          </w:rPr>
+          <w:t>i</w:t>
         </w:r>
       </w:ins>
-    </w:p>
-    <w:p>
-      <w:pPr>
-        <w:pStyle w:val="Normal"/>
-        <w:spacing w:lineRule="auto" w:line="480"/>
-        <w:jc w:val="both"/>
-        <w:rPr>
-          <w:rFonts w:ascii="Arial" w:hAnsi="Arial" w:cs="Arial"/>
-          <w:ins w:id="61" w:author="Linh Dang" w:date="2026-08-05T14:07:10Z"/>
-        </w:rPr>
-      </w:pPr>
-      <w:ins w:id="59" w:author="Linh Dang" w:date="2026-08-05T14:07:10Z">
+      <w:del w:id="37" w:author="Linh Dang" w:date="2026-08-07T15:26:06Z">
+        <w:r>
+          <w:rPr>
+            <w:rFonts w:cs="Arial" w:ascii="Arial" w:hAnsi="Arial"/>
+          </w:rPr>
+          <w:delText>1</w:delText>
+        </w:r>
+      </w:del>
+      <w:r>
+        <w:rPr>
+          <w:rFonts w:cs="Arial" w:ascii="Arial" w:hAnsi="Arial"/>
+        </w:rPr>
+        <w:t xml:space="preserve">) Restrictive filtering: taxa detected in any </w:t>
+      </w:r>
+      <w:commentRangeStart w:id="6"/>
+      <w:r>
+        <w:rPr>
+          <w:rFonts w:cs="Arial" w:ascii="Arial" w:hAnsi="Arial"/>
+        </w:rPr>
+        <w:t>NCT samples were excluded from further analyses; (</w:t>
+      </w:r>
+      <w:ins w:id="38" w:author="Linh Dang" w:date="2026-08-07T15:26:13Z">
+        <w:r>
+          <w:rPr>
+            <w:rFonts w:cs="Arial" w:ascii="Arial" w:hAnsi="Arial"/>
+          </w:rPr>
+          <w:t>ii</w:t>
+        </w:r>
+      </w:ins>
+      <w:del w:id="39" w:author="Linh Dang" w:date="2026-08-07T15:26:12Z">
+        <w:r>
+          <w:rPr>
+            <w:rFonts w:cs="Arial" w:ascii="Arial" w:hAnsi="Arial"/>
+          </w:rPr>
+          <w:delText>2</w:delText>
+        </w:r>
+      </w:del>
+      <w:r>
+        <w:rPr>
+          <w:rFonts w:cs="Arial" w:ascii="Arial" w:hAnsi="Arial"/>
+        </w:rPr>
+        <w:t xml:space="preserve">) Decontam (6): </w:t>
+      </w:r>
+      <w:ins w:id="40" w:author="Linh Dang" w:date="2026-08-07T15:25:27Z">
+        <w:r>
+          <w:rPr>
+            <w:rFonts w:cs="Arial" w:ascii="Arial" w:hAnsi="Arial"/>
+          </w:rPr>
+          <w:t xml:space="preserve">R package version 1.32.0, </w:t>
+        </w:r>
+      </w:ins>
+      <w:ins w:id="41" w:author="Linh Dang" w:date="2026-08-07T15:33:45Z">
+        <w:r>
+          <w:rPr>
+            <w:rFonts w:cs="Arial" w:ascii="Arial" w:hAnsi="Arial"/>
+          </w:rPr>
+          <w:t xml:space="preserve">a </w:t>
+        </w:r>
+      </w:ins>
+      <w:del w:id="42" w:author="Linh Dang" w:date="2026-08-07T15:33:52Z">
+        <w:r>
+          <w:rPr>
+            <w:rFonts w:cs="Arial" w:ascii="Arial" w:hAnsi="Arial"/>
+          </w:rPr>
+          <w:delText>probability-based</w:delText>
+        </w:r>
+      </w:del>
+      <w:ins w:id="43" w:author="Linh Dang" w:date="2026-08-07T15:33:53Z">
+        <w:r>
+          <w:rPr>
+            <w:rFonts w:cs="Arial" w:ascii="Arial" w:hAnsi="Arial"/>
+          </w:rPr>
+          <w:t xml:space="preserve"> </w:t>
+        </w:r>
+      </w:ins>
+      <w:ins w:id="44" w:author="Linh Dang" w:date="2026-08-07T15:33:53Z">
+        <w:r>
+          <w:rPr>
+            <w:rFonts w:cs="Arial" w:ascii="Arial" w:hAnsi="Arial"/>
+          </w:rPr>
+          <w:t xml:space="preserve">with a </w:t>
+        </w:r>
+      </w:ins>
+      <w:ins w:id="45" w:author="Linh Dang" w:date="2026-08-07T15:33:53Z">
+        <w:r>
+          <w:rPr>
+            <w:rFonts w:cs="Arial" w:ascii="Arial" w:hAnsi="Arial"/>
+          </w:rPr>
+          <w:t>prevalence-</w:t>
+        </w:r>
+      </w:ins>
+      <w:ins w:id="46" w:author="Linh Dang" w:date="2026-08-07T15:33:53Z">
+        <w:r>
+          <w:rPr>
+            <w:rFonts w:cs="Arial" w:ascii="Arial" w:hAnsi="Arial"/>
+          </w:rPr>
+          <w:t>based method</w:t>
+        </w:r>
+      </w:ins>
+      <w:r>
+        <w:rPr>
+          <w:rFonts w:cs="Arial" w:ascii="Arial" w:hAnsi="Arial"/>
+        </w:rPr>
+        <w:t xml:space="preserve"> classification of contaminant taxa using negative control</w:t>
+      </w:r>
+      <w:del w:id="47" w:author="Linh Dang" w:date="2026-08-07T15:33:39Z">
+        <w:r>
+          <w:rPr>
+            <w:rFonts w:cs="Arial" w:ascii="Arial" w:hAnsi="Arial"/>
+          </w:rPr>
+          <w:delText xml:space="preserve"> prevalence</w:delText>
+        </w:r>
+      </w:del>
+      <w:r>
+        <w:rPr>
+          <w:rFonts w:cs="Arial" w:ascii="Arial" w:hAnsi="Arial"/>
+        </w:rPr>
+        <w:t>; (</w:t>
+      </w:r>
+      <w:ins w:id="48" w:author="Linh Dang" w:date="2026-08-07T15:26:19Z">
+        <w:r>
+          <w:rPr>
+            <w:rFonts w:cs="Arial" w:ascii="Arial" w:hAnsi="Arial"/>
+          </w:rPr>
+          <w:t>iii</w:t>
+        </w:r>
+      </w:ins>
+      <w:del w:id="49" w:author="Linh Dang" w:date="2026-08-07T15:26:18Z">
+        <w:r>
+          <w:rPr>
+            <w:rFonts w:cs="Arial" w:ascii="Arial" w:hAnsi="Arial"/>
+          </w:rPr>
+          <w:delText>3</w:delText>
+        </w:r>
+      </w:del>
+      <w:r>
+        <w:rPr>
+          <w:rFonts w:cs="Arial" w:ascii="Arial" w:hAnsi="Arial"/>
+        </w:rPr>
+        <w:t xml:space="preserve">) SCRuB (2): </w:t>
+      </w:r>
+      <w:del w:id="50" w:author="Linh Dang" w:date="2026-08-07T15:38:49Z">
+        <w:r>
+          <w:rPr>
+            <w:rFonts w:cs="Arial" w:ascii="Arial" w:hAnsi="Arial"/>
+          </w:rPr>
+          <w:delText>source tracking-based contaminant removal</w:delText>
+        </w:r>
+      </w:del>
+      <w:ins w:id="51" w:author="Linh Dang" w:date="2026-08-07T15:38:55Z">
+        <w:r>
+          <w:rPr>
+            <w:rFonts w:cs="Arial" w:ascii="Arial" w:hAnsi="Arial"/>
+          </w:rPr>
+          <w:t xml:space="preserve">Statistical Correction of Reagent-derived Bias, </w:t>
+        </w:r>
+      </w:ins>
+      <w:ins w:id="52" w:author="Linh Dang" w:date="2026-08-07T15:45:39Z">
+        <w:r>
+          <w:rPr>
+            <w:rFonts w:cs="Arial" w:ascii="Arial" w:hAnsi="Arial"/>
+          </w:rPr>
+          <w:t xml:space="preserve">models contamination as a mixture of biological signal and </w:t>
+        </w:r>
+      </w:ins>
+      <w:ins w:id="53" w:author="Linh Dang" w:date="2026-08-07T15:45:39Z">
+        <w:r>
+          <w:rPr>
+            <w:rFonts w:cs="Arial" w:ascii="Arial" w:hAnsi="Arial"/>
+          </w:rPr>
+          <w:t>ackground noise</w:t>
+        </w:r>
+      </w:ins>
+      <w:ins w:id="54" w:author="Linh Dang" w:date="2026-08-07T15:45:39Z">
+        <w:r>
+          <w:rPr>
+            <w:rFonts w:cs="Arial" w:ascii="Arial" w:hAnsi="Arial"/>
+          </w:rPr>
+          <w:t xml:space="preserve"> contaminants and estimates the true microbial composition of each sample.</w:t>
+        </w:r>
+      </w:ins>
+      <w:r>
+        <w:rPr>
+          <w:rFonts w:cs="Arial" w:ascii="Arial" w:hAnsi="Arial"/>
+        </w:rPr>
+        <w:t>; and (</w:t>
+      </w:r>
+      <w:ins w:id="55" w:author="Linh Dang" w:date="2026-08-07T15:46:34Z">
+        <w:r>
+          <w:rPr>
+            <w:rFonts w:cs="Arial" w:ascii="Arial" w:hAnsi="Arial"/>
+          </w:rPr>
+          <w:t>iv</w:t>
+        </w:r>
+      </w:ins>
+      <w:del w:id="56" w:author="Linh Dang" w:date="2026-08-07T15:46:33Z">
+        <w:r>
+          <w:rPr>
+            <w:rFonts w:cs="Arial" w:ascii="Arial" w:hAnsi="Arial"/>
+          </w:rPr>
+          <w:delText>4</w:delText>
+        </w:r>
+      </w:del>
+      <w:r>
+        <w:rPr>
+          <w:rFonts w:cs="Arial" w:ascii="Arial" w:hAnsi="Arial"/>
+        </w:rPr>
+        <w:t>) Nejman et. al. procedure (7): the decontamination strategy incorporating multiple filtering criteria.</w:t>
+      </w:r>
+      <w:ins w:id="57" w:author="Linh Dang" w:date="2026-08-07T15:49:41Z">
+        <w:r>
+          <w:rPr>
+            <w:rFonts w:cs="Arial" w:ascii="Arial" w:hAnsi="Arial"/>
+          </w:rPr>
+          <w:t xml:space="preserve"> </w:t>
+        </w:r>
+      </w:ins>
+      <w:ins w:id="58" w:author="Linh Dang" w:date="2026-08-07T15:49:41Z">
+        <w:r>
+          <w:rPr>
+            <w:rFonts w:cs="Arial" w:ascii="Arial" w:hAnsi="Arial"/>
+          </w:rPr>
+          <w:t xml:space="preserve">Our adaptation of Nj procedure is as follows. First, </w:t>
+        </w:r>
+      </w:ins>
+      <w:ins w:id="59" w:author="Linh Dang" w:date="2026-08-07T15:57:55Z">
+        <w:r>
+          <w:rPr>
+            <w:rFonts w:cs="Arial" w:ascii="Arial" w:hAnsi="Arial"/>
+          </w:rPr>
+          <w:t xml:space="preserve">taxa whose prevalence </w:t>
+        </w:r>
+      </w:ins>
+      <w:ins w:id="60" w:author="Linh Dang" w:date="2026-08-07T16:00:09Z">
+        <w:r>
+          <w:rPr>
+            <w:rFonts w:cs="Arial" w:ascii="Arial" w:hAnsi="Arial"/>
+          </w:rPr>
+          <w:t xml:space="preserve">is high in NCT samples will be removed. The cutoff threshold is determined </w:t>
+        </w:r>
+      </w:ins>
+      <w:ins w:id="61" w:author="Linh Dang" w:date="2026-08-07T16:10:58Z">
+        <w:r>
+          <w:rPr>
+            <w:rFonts w:cs="Arial" w:ascii="Arial" w:hAnsi="Arial"/>
+          </w:rPr>
+          <w:t xml:space="preserve">in the original Nejman et al. </w:t>
+        </w:r>
+      </w:ins>
+      <w:ins w:id="62" w:author="Linh Dang" w:date="2026-08-07T16:10:58Z">
         <w:r>
           <w:rPr>
             <w:rFonts w:eastAsia="Aptos" w:cs="Arial" w:ascii="Arial" w:hAnsi="Arial"/>
@@ -5592,69 +5611,155 @@
             <w:lang w:val="en-US" w:eastAsia="zh-CN" w:bidi="ar-SA"/>
             <w14:ligatures w14:val="none"/>
           </w:rPr>
-          <w:t>X</w:t>
+          <w:t>P</w:t>
         </w:r>
       </w:ins>
-      <w:ins w:id="60" w:author="Linh Dang" w:date="2026-08-05T14:07:10Z">
+      <w:ins w:id="63" w:author="Linh Dang" w:date="2026-08-07T16:10:58Z">
         <w:r>
           <w:rPr>
             <w:rFonts w:cs="Arial" w:ascii="Arial" w:hAnsi="Arial"/>
           </w:rPr>
-          <w:t>xx</w:t>
+          <w:t xml:space="preserve">ublication. Second, </w:t>
         </w:r>
       </w:ins>
-    </w:p>
-    <w:p>
-      <w:pPr>
-        <w:pStyle w:val="Heading3"/>
-        <w:spacing w:lineRule="auto" w:line="480"/>
-        <w:jc w:val="both"/>
-        <w:rPr>
-          <w:rFonts w:ascii="Arial" w:hAnsi="Arial" w:cs="Arial"/>
-          <w:ins w:id="64" w:author="Linh Dang" w:date="2026-08-05T14:07:10Z"/>
-        </w:rPr>
-      </w:pPr>
-      <w:ins w:id="62" w:author="Linh Dang" w:date="2026-08-05T14:07:10Z">
+      <w:ins w:id="64" w:author="Linh Dang" w:date="2026-08-07T16:12:09Z">
         <w:r>
           <w:rPr>
             <w:rFonts w:cs="Arial" w:ascii="Arial" w:hAnsi="Arial"/>
           </w:rPr>
-          <w:t>Composi</w:t>
+          <w:t>for those taxa whose prevalence are small in both NCT and true samples, we applied statistical F</w:t>
         </w:r>
       </w:ins>
-      <w:ins w:id="63" w:author="Linh Dang" w:date="2026-08-05T14:07:10Z">
+      <w:ins w:id="65" w:author="Linh Dang" w:date="2026-08-07T16:13:10Z">
         <w:r>
           <w:rPr>
             <w:rFonts w:cs="Arial" w:ascii="Arial" w:hAnsi="Arial"/>
           </w:rPr>
-          <w:t>tional Overlap Ratio</w:t>
+          <w:t xml:space="preserve">isher exact test for each batch to determine if a taxon is a </w:t>
         </w:r>
       </w:ins>
-    </w:p>
-    <w:p>
-      <w:pPr>
-        <w:pStyle w:val="Normal"/>
-        <w:spacing w:lineRule="auto" w:line="480"/>
-        <w:jc w:val="both"/>
-        <w:rPr>
-          <w:rFonts w:ascii="Arial" w:hAnsi="Arial" w:cs="Arial"/>
-          <w:ins w:id="67" w:author="Linh Dang" w:date="2026-08-05T14:07:10Z"/>
-        </w:rPr>
-      </w:pPr>
-      <w:ins w:id="65" w:author="Linh Dang" w:date="2026-08-05T14:07:10Z">
+      <w:ins w:id="66" w:author="Linh Dang" w:date="2026-08-07T16:14:11Z">
         <w:r>
           <w:rPr>
             <w:rFonts w:cs="Arial" w:ascii="Arial" w:hAnsi="Arial"/>
           </w:rPr>
-          <w:t>x</w:t>
+          <w:t>contaminant.</w:t>
         </w:r>
       </w:ins>
-      <w:ins w:id="66" w:author="Linh Dang" w:date="2026-08-05T14:07:10Z">
+      <w:r>
+        <w:rPr>
+          <w:rFonts w:cs="Arial" w:ascii="Arial" w:hAnsi="Arial"/>
+        </w:rPr>
+        <w:t xml:space="preserve"> Notbly, instead of binomial testing as Nejman et al. described in (7), we applied Fisher test instead due to small number of samples and negative controls. The implementation of those four decontamination methods is available in the github repository</w:t>
+      </w:r>
+      <w:bookmarkEnd w:id="9"/>
+      <w:r>
+        <w:rPr>
+          <w:rFonts w:cs="Arial" w:ascii="Arial" w:hAnsi="Arial"/>
+        </w:rPr>
+      </w:r>
+      <w:commentRangeEnd w:id="6"/>
+      <w:r>
+        <w:commentReference w:id="6"/>
+      </w:r>
+      <w:r>
+        <w:rPr>
+          <w:rFonts w:cs="Arial" w:ascii="Arial" w:hAnsi="Arial"/>
+        </w:rPr>
+        <w:t>.</w:t>
+      </w:r>
+    </w:p>
+    <w:p>
+      <w:pPr>
+        <w:pStyle w:val="Heading3"/>
+        <w:spacing w:lineRule="auto" w:line="480"/>
+        <w:jc w:val="both"/>
+        <w:rPr>
+          <w:rFonts w:ascii="Arial" w:hAnsi="Arial" w:cs="Arial"/>
+        </w:rPr>
+      </w:pPr>
+      <w:r>
+        <w:rPr>
+          <w:rFonts w:cs="Arial" w:ascii="Arial" w:hAnsi="Arial"/>
+        </w:rPr>
+        <w:t>Composite Score</w:t>
+      </w:r>
+    </w:p>
+    <w:p>
+      <w:pPr>
+        <w:pStyle w:val="FirstParagraph"/>
+        <w:spacing w:lineRule="auto" w:line="480"/>
+        <w:jc w:val="both"/>
+        <w:rPr>
+          <w:rFonts w:ascii="Arial" w:hAnsi="Arial" w:cs="Arial"/>
+        </w:rPr>
+      </w:pPr>
+      <w:bookmarkStart w:id="10" w:name="materials-and-methods"/>
+      <w:bookmarkStart w:id="11" w:name="composite-score"/>
+      <w:r>
+        <w:rPr>
+          <w:rFonts w:cs="Arial" w:ascii="Arial" w:hAnsi="Arial"/>
+        </w:rPr>
+        <w:t>Composite score is calculated from the bacterial profile after or before decontamination and the longitudinal contaminant survey. This score comprised of two parts: yield and purity. Yield is an entity quantifying the percentage of number of putative true taxa not overlap with NCT survey over number of total observed taxa, while the purity calculates the fraction between the same nominator over the number of putative true taxa from a certain decontamination method. The technical detail of the calculation could be found at Supplementary.</w:t>
+      </w:r>
+      <w:bookmarkEnd w:id="10"/>
+      <w:bookmarkEnd w:id="11"/>
+    </w:p>
+    <w:p>
+      <w:pPr>
+        <w:pStyle w:val="Heading3"/>
+        <w:spacing w:lineRule="auto" w:line="480"/>
+        <w:jc w:val="both"/>
+        <w:rPr>
+          <w:rFonts w:ascii="Arial" w:hAnsi="Arial" w:cs="Arial"/>
+          <w:ins w:id="68" w:author="Linh Dang" w:date="2026-08-05T14:07:10Z"/>
+        </w:rPr>
+      </w:pPr>
+      <w:ins w:id="67" w:author="Linh Dang" w:date="2026-08-05T14:07:10Z">
         <w:r>
           <w:rPr>
             <w:rFonts w:cs="Arial" w:ascii="Arial" w:hAnsi="Arial"/>
           </w:rPr>
-          <w:t>xx</w:t>
+          <w:t>Inter-replicate Distance</w:t>
+        </w:r>
+      </w:ins>
+    </w:p>
+    <w:p>
+      <w:pPr>
+        <w:pStyle w:val="Normal"/>
+        <w:spacing w:lineRule="auto" w:line="480"/>
+        <w:jc w:val="both"/>
+        <w:rPr>
+          <w:rFonts w:ascii="Arial" w:hAnsi="Arial" w:cs="Arial"/>
+          <w:ins w:id="71" w:author="Linh Dang" w:date="2026-08-05T14:07:10Z"/>
+        </w:rPr>
+      </w:pPr>
+      <w:ins w:id="69" w:author="Linh Dang" w:date="2026-08-07T12:54:00Z">
+        <w:r>
+          <w:rPr>
+            <w:rFonts w:eastAsia="Aptos" w:cs="Arial" w:ascii="Arial" w:hAnsi="Arial"/>
+            <w:color w:val="auto"/>
+            <w:kern w:val="0"/>
+            <w:sz w:val="24"/>
+            <w:szCs w:val="24"/>
+            <w:lang w:val="en-US" w:eastAsia="zh-CN" w:bidi="ar-SA"/>
+            <w14:ligatures w14:val="none"/>
+          </w:rPr>
+          <w:t>Multiple technical replicates derived from the same tumor sample were sequenced at different time points. Inter-replicate distance (or dissimilarity) was quantified using beta diversity metrics, such as the Bray–Curtis and Jaccard distances, to assess the concordance of their microbial compositions. The central assumption of this study is that contaminant taxa introduce technical noise, thereby increasing the dissimilarity between replicates. Consequently, effective removal of contaminant taxa should reduce the inter-replicate distance, resulting in greater concordance among technical replicates.</w:t>
+        </w:r>
+      </w:ins>
+      <w:ins w:id="70" w:author="Linh Dang" w:date="2026-08-05T14:07:10Z">
+        <w:r>
+          <w:rPr>
+            <w:rFonts w:eastAsia="Aptos" w:cs="Arial" w:ascii="Arial" w:hAnsi="Arial"/>
+            <w:color w:val="auto"/>
+            <w:kern w:val="0"/>
+            <w:sz w:val="24"/>
+            <w:szCs w:val="24"/>
+            <w:lang w:val="en-US" w:eastAsia="zh-CN" w:bidi="ar-SA"/>
+            <w14:ligatures w14:val="none"/>
+          </w:rPr>
+          <w:t xml:space="preserve"> </w:t>
         </w:r>
       </w:ins>
     </w:p>
@@ -7045,7 +7150,7 @@
   <w:comment w:id="0" w:author="adm_neesse" w:date="2026-08-01T09:30:00Z" w:initials="a">
     <w:p>
       <w:pPr>
-        <w:overflowPunct w:val="true"/>
+        <w:overflowPunct w:val="false"/>
         <w:spacing w:before="0" w:after="0"/>
         <w:rPr/>
       </w:pPr>
@@ -7061,8 +7166,8 @@
   <w:comment w:id="1" w:author="Linh Dang" w:date="2026-07-31T16:23:00Z" w:initials="LD">
     <w:p>
       <w:pPr>
-        <w:overflowPunct w:val="false"/>
-        <w:spacing w:before="318" w:after="0"/>
+        <w:overflowPunct w:val="true"/>
+        <w:spacing w:before="561" w:after="0"/>
         <w:rPr/>
       </w:pPr>
       <w:r>
@@ -7077,7 +7182,7 @@
   <w:comment w:id="2" w:author="Christoph Ammer-Herrmenau" w:date="2026-04-25T22:24:00Z" w:initials="CA">
     <w:p>
       <w:pPr>
-        <w:overflowPunct w:val="true"/>
+        <w:overflowPunct w:val="false"/>
         <w:spacing w:before="0" w:after="0"/>
         <w:rPr/>
       </w:pPr>
@@ -7093,7 +7198,7 @@
   <w:comment w:id="3" w:author="Christoph Ammer-Herrmenau" w:date="2026-04-25T22:28:00Z" w:initials="CA">
     <w:p>
       <w:pPr>
-        <w:overflowPunct w:val="true"/>
+        <w:overflowPunct w:val="false"/>
         <w:spacing w:before="0" w:after="0"/>
         <w:rPr/>
       </w:pPr>
@@ -7109,7 +7214,7 @@
   <w:comment w:id="4" w:author="Christoph Ammer-Herrmenau" w:date="2026-04-25T22:33:00Z" w:initials="CA">
     <w:p>
       <w:pPr>
-        <w:overflowPunct w:val="true"/>
+        <w:overflowPunct w:val="false"/>
         <w:spacing w:before="0" w:after="0"/>
         <w:rPr/>
       </w:pPr>
@@ -7157,7 +7262,7 @@
   <w:comment w:id="5" w:author="Christoph Ammer-Herrmenau" w:date="2026-04-25T22:22:00Z" w:initials="CA">
     <w:p>
       <w:pPr>
-        <w:overflowPunct w:val="true"/>
+        <w:overflowPunct w:val="false"/>
         <w:spacing w:before="0" w:after="0"/>
         <w:rPr/>
       </w:pPr>
@@ -7173,7 +7278,7 @@
   <w:comment w:id="6" w:author="Christoph Ammer-Herrmenau" w:date="2026-04-25T22:21:00Z" w:initials="CA">
     <w:p>
       <w:pPr>
-        <w:overflowPunct w:val="true"/>
+        <w:overflowPunct w:val="false"/>
         <w:spacing w:before="0" w:after="0"/>
         <w:rPr/>
       </w:pPr>

</xml_diff>